<commit_message>
Rich agent answers, thinking bubble, library-access intent, variable-length docs, demote duplicate copies
- Agent: library-access handler reads real library permissions; Markdown-rich answers rendered safely in the UI; animated thinking bubble
- Foundry agent instructions: use live evidence for governance questions, rich Markdown format
- Corpus: random (stable) page/slide/sheet counts; copies seeded as Draft duplicates of approved originals
- Fix agent provisioning: keep governance source fields, multi-hub smoke test
- Refresh screenshots, agent test and READMEs

Co-authored-by: Copilot <223556219+Copilot@users.noreply.github.com>
</commit_message>
<xml_diff>
--- a/data/sites/hr/Compensation and Benefits/401-k-enrollment-and-employer-match-guide.docx
+++ b/data/sites/hr/Compensation and Benefits/401-k-enrollment-and-employer-match-guide.docx
@@ -260,7 +260,7 @@
           <w:color w:val="808080"/>
           <w:sz w:val="16"/>
         </w:rPr>
-        <w:t>Page 1 of 12 | HR Knowledge Hub | Compensation and Benefits | SharePoint Online</w:t>
+        <w:t>Page 1 of 4 | HR Knowledge Hub | Compensation and Benefits | SharePoint Online</w:t>
       </w:r>
     </w:p>
     <w:p>
@@ -587,7 +587,7 @@
           <w:color w:val="808080"/>
           <w:sz w:val="16"/>
         </w:rPr>
-        <w:t>Page 2 of 12 | HR Knowledge Hub | Compensation and Benefits | SharePoint Online</w:t>
+        <w:t>Page 2 of 4 | HR Knowledge Hub | Compensation and Benefits | SharePoint Online</w:t>
       </w:r>
     </w:p>
     <w:p>
@@ -878,7 +878,7 @@
           <w:color w:val="808080"/>
           <w:sz w:val="16"/>
         </w:rPr>
-        <w:t>Page 3 of 12 | HR Knowledge Hub | Compensation and Benefits | SharePoint Online</w:t>
+        <w:t>Page 3 of 4 | HR Knowledge Hub | Compensation and Benefits | SharePoint Online</w:t>
       </w:r>
     </w:p>
     <w:p>
@@ -891,12 +891,12 @@
         <w:pStyle w:val="Heading1"/>
       </w:pPr>
       <w:r>
-        <w:t>Section 4: Operational KPIs &amp; Benchmarks</w:t>
+        <w:t>Section 4: Appendix, Lineage &amp; Sign-off</w:t>
       </w:r>
     </w:p>
     <w:p>
       <w:r>
-        <w:t>Explains automatic enrollment defaults, the employer match formula, and vesting schedule for retirement contributions. Section 4 (Operational KPIs &amp; Benchmarks) applies to Compensation and Benefits within HR Knowledge Hub and is maintained by Sam Whitfield. Tracks baseline performance, target SLAs, and quarterly benchmark progression.</w:t>
+        <w:t>Explains automatic enrollment defaults, the employer match formula, and vesting schedule for retirement contributions. Section 4 (Appendix, Lineage &amp; Sign-off) applies to Compensation and Benefits within HR Knowledge Hub and is maintained by Sam Whitfield. Records document lineage, governance metadata, version history, and owner sign-off.</w:t>
       </w:r>
     </w:p>
     <w:p>
@@ -1205,2479 +1205,7 @@
           <w:color w:val="808080"/>
           <w:sz w:val="16"/>
         </w:rPr>
-        <w:t>Page 4 of 12 | HR Knowledge Hub | Compensation and Benefits | SharePoint Online</w:t>
-      </w:r>
-    </w:p>
-    <w:p>
-      <w:r>
-        <w:br w:type="page"/>
-      </w:r>
-    </w:p>
-    <w:p>
-      <w:pPr>
-        <w:pStyle w:val="Heading1"/>
-      </w:pPr>
-      <w:r>
-        <w:t>Section 5: Roles, Responsibilities &amp; RACI</w:t>
-      </w:r>
-    </w:p>
-    <w:p>
-      <w:r>
-        <w:t>Explains automatic enrollment defaults, the employer match formula, and vesting schedule for retirement contributions. Section 5 (Roles, Responsibilities &amp; RACI) applies to Compensation and Benefits within HR Knowledge Hub and is maintained by Sam Whitfield. Clarifies ownership across accountable executives, operational leads, and reviewers.</w:t>
-      </w:r>
-    </w:p>
-    <w:p>
-      <w:r>
-        <w:t>Operational requirement 5.1: New hires are auto-enrolled at 4% contribution after 30 days unless they opt out. Secondary control 5.2: Employer matches 50% of the first 6% an employee contributes.</w:t>
-      </w:r>
-    </w:p>
-    <w:p>
-      <w:pPr>
-        <w:pStyle w:val="ListBullet"/>
-      </w:pPr>
-      <w:r>
-        <w:t>New hires are auto-enrolled at 4% contribution after 30 days unless they opt out.</w:t>
-      </w:r>
-    </w:p>
-    <w:p>
-      <w:pPr>
-        <w:pStyle w:val="ListBullet"/>
-      </w:pPr>
-      <w:r>
-        <w:t>Employer matches 50% of the first 6% an employee contributes.</w:t>
-      </w:r>
-    </w:p>
-    <w:p>
-      <w:pPr>
-        <w:pStyle w:val="ListBullet"/>
-      </w:pPr>
-      <w:r>
-        <w:t>Section 5 review cadence is tracked by Sam Whitfield under Compensation and Benefits governance.</w:t>
-      </w:r>
-    </w:p>
-    <w:tbl>
-      <w:tblPr>
-        <w:tblStyle w:val="LightGrid-Accent1"/>
-        <w:tblW w:type="auto" w:w="0"/>
-        <w:tblLook w:firstColumn="1" w:firstRow="1" w:lastColumn="0" w:lastRow="0" w:noHBand="0" w:noVBand="1" w:val="04A0"/>
-      </w:tblPr>
-      <w:tblGrid>
-        <w:gridCol w:w="2160"/>
-        <w:gridCol w:w="2160"/>
-        <w:gridCol w:w="2160"/>
-        <w:gridCol w:w="2160"/>
-      </w:tblGrid>
-      <w:tr>
-        <w:tc>
-          <w:tcPr>
-            <w:tcW w:type="dxa" w:w="2160"/>
-          </w:tcPr>
-          <w:p>
-            <w:r>
-              <w:rPr>
-                <w:b/>
-              </w:rPr>
-              <w:t>Control Area</w:t>
-            </w:r>
-          </w:p>
-        </w:tc>
-        <w:tc>
-          <w:tcPr>
-            <w:tcW w:type="dxa" w:w="2160"/>
-          </w:tcPr>
-          <w:p>
-            <w:r>
-              <w:rPr>
-                <w:b/>
-              </w:rPr>
-              <w:t>Owner</w:t>
-            </w:r>
-          </w:p>
-        </w:tc>
-        <w:tc>
-          <w:tcPr>
-            <w:tcW w:type="dxa" w:w="2160"/>
-          </w:tcPr>
-          <w:p>
-            <w:r>
-              <w:rPr>
-                <w:b/>
-              </w:rPr>
-              <w:t>Target SLA</w:t>
-            </w:r>
-          </w:p>
-        </w:tc>
-        <w:tc>
-          <w:tcPr>
-            <w:tcW w:type="dxa" w:w="2160"/>
-          </w:tcPr>
-          <w:p>
-            <w:r>
-              <w:rPr>
-                <w:b/>
-              </w:rPr>
-              <w:t>Verification Status</w:t>
-            </w:r>
-          </w:p>
-        </w:tc>
-      </w:tr>
-      <w:tr>
-        <w:tc>
-          <w:tcPr>
-            <w:tcW w:type="dxa" w:w="2160"/>
-          </w:tcPr>
-          <w:p>
-            <w:r>
-              <w:t>Compensation and Benefits</w:t>
-            </w:r>
-          </w:p>
-        </w:tc>
-        <w:tc>
-          <w:tcPr>
-            <w:tcW w:type="dxa" w:w="2160"/>
-          </w:tcPr>
-          <w:p>
-            <w:r>
-              <w:t>Sam Whitfield</w:t>
-            </w:r>
-          </w:p>
-        </w:tc>
-        <w:tc>
-          <w:tcPr>
-            <w:tcW w:type="dxa" w:w="2160"/>
-          </w:tcPr>
-          <w:p>
-            <w:r>
-              <w:t>5 business days</w:t>
-            </w:r>
-          </w:p>
-        </w:tc>
-        <w:tc>
-          <w:tcPr>
-            <w:tcW w:type="dxa" w:w="2160"/>
-          </w:tcPr>
-          <w:p>
-            <w:r>
-              <w:t>Verified</w:t>
-            </w:r>
-          </w:p>
-        </w:tc>
-      </w:tr>
-      <w:tr>
-        <w:tc>
-          <w:tcPr>
-            <w:tcW w:type="dxa" w:w="2160"/>
-          </w:tcPr>
-          <w:p>
-            <w:r>
-              <w:t>401(k) Enrollment and Employ Gate 1</w:t>
-            </w:r>
-          </w:p>
-        </w:tc>
-        <w:tc>
-          <w:tcPr>
-            <w:tcW w:type="dxa" w:w="2160"/>
-          </w:tcPr>
-          <w:p>
-            <w:r>
-              <w:t>Sam Whitfield</w:t>
-            </w:r>
-          </w:p>
-        </w:tc>
-        <w:tc>
-          <w:tcPr>
-            <w:tcW w:type="dxa" w:w="2160"/>
-          </w:tcPr>
-          <w:p>
-            <w:r>
-              <w:t>3 business days</w:t>
-            </w:r>
-          </w:p>
-        </w:tc>
-        <w:tc>
-          <w:tcPr>
-            <w:tcW w:type="dxa" w:w="2160"/>
-          </w:tcPr>
-          <w:p>
-            <w:r>
-              <w:t>Active</w:t>
-            </w:r>
-          </w:p>
-        </w:tc>
-      </w:tr>
-      <w:tr>
-        <w:tc>
-          <w:tcPr>
-            <w:tcW w:type="dxa" w:w="2160"/>
-          </w:tcPr>
-          <w:p>
-            <w:r>
-              <w:t>401(k) Enrollment and Employ Gate 2</w:t>
-            </w:r>
-          </w:p>
-        </w:tc>
-        <w:tc>
-          <w:tcPr>
-            <w:tcW w:type="dxa" w:w="2160"/>
-          </w:tcPr>
-          <w:p>
-            <w:r>
-              <w:t>Sam Whitfield</w:t>
-            </w:r>
-          </w:p>
-        </w:tc>
-        <w:tc>
-          <w:tcPr>
-            <w:tcW w:type="dxa" w:w="2160"/>
-          </w:tcPr>
-          <w:p>
-            <w:r>
-              <w:t>10 business days</w:t>
-            </w:r>
-          </w:p>
-        </w:tc>
-        <w:tc>
-          <w:tcPr>
-            <w:tcW w:type="dxa" w:w="2160"/>
-          </w:tcPr>
-          <w:p>
-            <w:r>
-              <w:t>Monitored</w:t>
-            </w:r>
-          </w:p>
-        </w:tc>
-      </w:tr>
-      <w:tr>
-        <w:tc>
-          <w:tcPr>
-            <w:tcW w:type="dxa" w:w="2160"/>
-          </w:tcPr>
-          <w:p>
-            <w:r>
-              <w:t>Sec-5</w:t>
-            </w:r>
-          </w:p>
-        </w:tc>
-        <w:tc>
-          <w:tcPr>
-            <w:tcW w:type="dxa" w:w="2160"/>
-          </w:tcPr>
-          <w:p>
-            <w:r>
-              <w:t>Sam Whitfield</w:t>
-            </w:r>
-          </w:p>
-        </w:tc>
-        <w:tc>
-          <w:tcPr>
-            <w:tcW w:type="dxa" w:w="2160"/>
-          </w:tcPr>
-          <w:p>
-            <w:r>
-              <w:t>3 business days</w:t>
-            </w:r>
-          </w:p>
-        </w:tc>
-        <w:tc>
-          <w:tcPr>
-            <w:tcW w:type="dxa" w:w="2160"/>
-          </w:tcPr>
-          <w:p>
-            <w:r>
-              <w:t>Stage 5 Verified</w:t>
-            </w:r>
-          </w:p>
-        </w:tc>
-      </w:tr>
-    </w:tbl>
-    <w:p>
-      <w:r>
-        <w:rPr>
-          <w:color w:val="808080"/>
-          <w:sz w:val="16"/>
-        </w:rPr>
-        <w:t>Page 5 of 12 | HR Knowledge Hub | Compensation and Benefits | SharePoint Online</w:t>
-      </w:r>
-    </w:p>
-    <w:p>
-      <w:r>
-        <w:br w:type="page"/>
-      </w:r>
-    </w:p>
-    <w:p>
-      <w:pPr>
-        <w:pStyle w:val="Heading1"/>
-      </w:pPr>
-      <w:r>
-        <w:t>Section 6: Standard Operating Procedures</w:t>
-      </w:r>
-    </w:p>
-    <w:p>
-      <w:r>
-        <w:t>Explains automatic enrollment defaults, the employer match formula, and vesting schedule for retirement contributions. Section 6 (Standard Operating Procedures) applies to Compensation and Benefits within HR Knowledge Hub and is maintained by Sam Whitfield. Provides step-by-step execution checklists, intake criteria, and verification gates.</w:t>
-      </w:r>
-    </w:p>
-    <w:p>
-      <w:r>
-        <w:t>Operational requirement 6.1: Employer matches 50% of the first 6% an employee contributes. Secondary control 6.2: Employer match vests over four years on a graded schedule.</w:t>
-      </w:r>
-    </w:p>
-    <w:p>
-      <w:pPr>
-        <w:pStyle w:val="ListBullet"/>
-      </w:pPr>
-      <w:r>
-        <w:t>Employer matches 50% of the first 6% an employee contributes.</w:t>
-      </w:r>
-    </w:p>
-    <w:p>
-      <w:pPr>
-        <w:pStyle w:val="ListBullet"/>
-      </w:pPr>
-      <w:r>
-        <w:t>Employer match vests over four years on a graded schedule.</w:t>
-      </w:r>
-    </w:p>
-    <w:p>
-      <w:pPr>
-        <w:pStyle w:val="ListBullet"/>
-      </w:pPr>
-      <w:r>
-        <w:t>Section 6 review cadence is tracked by Sam Whitfield under Compensation and Benefits governance.</w:t>
-      </w:r>
-    </w:p>
-    <w:tbl>
-      <w:tblPr>
-        <w:tblStyle w:val="LightGrid-Accent1"/>
-        <w:tblW w:type="auto" w:w="0"/>
-        <w:tblLook w:firstColumn="1" w:firstRow="1" w:lastColumn="0" w:lastRow="0" w:noHBand="0" w:noVBand="1" w:val="04A0"/>
-      </w:tblPr>
-      <w:tblGrid>
-        <w:gridCol w:w="2160"/>
-        <w:gridCol w:w="2160"/>
-        <w:gridCol w:w="2160"/>
-        <w:gridCol w:w="2160"/>
-      </w:tblGrid>
-      <w:tr>
-        <w:tc>
-          <w:tcPr>
-            <w:tcW w:type="dxa" w:w="2160"/>
-          </w:tcPr>
-          <w:p>
-            <w:r>
-              <w:rPr>
-                <w:b/>
-              </w:rPr>
-              <w:t>Control Area</w:t>
-            </w:r>
-          </w:p>
-        </w:tc>
-        <w:tc>
-          <w:tcPr>
-            <w:tcW w:type="dxa" w:w="2160"/>
-          </w:tcPr>
-          <w:p>
-            <w:r>
-              <w:rPr>
-                <w:b/>
-              </w:rPr>
-              <w:t>Owner</w:t>
-            </w:r>
-          </w:p>
-        </w:tc>
-        <w:tc>
-          <w:tcPr>
-            <w:tcW w:type="dxa" w:w="2160"/>
-          </w:tcPr>
-          <w:p>
-            <w:r>
-              <w:rPr>
-                <w:b/>
-              </w:rPr>
-              <w:t>Target SLA</w:t>
-            </w:r>
-          </w:p>
-        </w:tc>
-        <w:tc>
-          <w:tcPr>
-            <w:tcW w:type="dxa" w:w="2160"/>
-          </w:tcPr>
-          <w:p>
-            <w:r>
-              <w:rPr>
-                <w:b/>
-              </w:rPr>
-              <w:t>Verification Status</w:t>
-            </w:r>
-          </w:p>
-        </w:tc>
-      </w:tr>
-      <w:tr>
-        <w:tc>
-          <w:tcPr>
-            <w:tcW w:type="dxa" w:w="2160"/>
-          </w:tcPr>
-          <w:p>
-            <w:r>
-              <w:t>Compensation and Benefits</w:t>
-            </w:r>
-          </w:p>
-        </w:tc>
-        <w:tc>
-          <w:tcPr>
-            <w:tcW w:type="dxa" w:w="2160"/>
-          </w:tcPr>
-          <w:p>
-            <w:r>
-              <w:t>Sam Whitfield</w:t>
-            </w:r>
-          </w:p>
-        </w:tc>
-        <w:tc>
-          <w:tcPr>
-            <w:tcW w:type="dxa" w:w="2160"/>
-          </w:tcPr>
-          <w:p>
-            <w:r>
-              <w:t>5 business days</w:t>
-            </w:r>
-          </w:p>
-        </w:tc>
-        <w:tc>
-          <w:tcPr>
-            <w:tcW w:type="dxa" w:w="2160"/>
-          </w:tcPr>
-          <w:p>
-            <w:r>
-              <w:t>Verified</w:t>
-            </w:r>
-          </w:p>
-        </w:tc>
-      </w:tr>
-      <w:tr>
-        <w:tc>
-          <w:tcPr>
-            <w:tcW w:type="dxa" w:w="2160"/>
-          </w:tcPr>
-          <w:p>
-            <w:r>
-              <w:t>401(k) Enrollment and Employ Gate 1</w:t>
-            </w:r>
-          </w:p>
-        </w:tc>
-        <w:tc>
-          <w:tcPr>
-            <w:tcW w:type="dxa" w:w="2160"/>
-          </w:tcPr>
-          <w:p>
-            <w:r>
-              <w:t>Sam Whitfield</w:t>
-            </w:r>
-          </w:p>
-        </w:tc>
-        <w:tc>
-          <w:tcPr>
-            <w:tcW w:type="dxa" w:w="2160"/>
-          </w:tcPr>
-          <w:p>
-            <w:r>
-              <w:t>3 business days</w:t>
-            </w:r>
-          </w:p>
-        </w:tc>
-        <w:tc>
-          <w:tcPr>
-            <w:tcW w:type="dxa" w:w="2160"/>
-          </w:tcPr>
-          <w:p>
-            <w:r>
-              <w:t>Active</w:t>
-            </w:r>
-          </w:p>
-        </w:tc>
-      </w:tr>
-      <w:tr>
-        <w:tc>
-          <w:tcPr>
-            <w:tcW w:type="dxa" w:w="2160"/>
-          </w:tcPr>
-          <w:p>
-            <w:r>
-              <w:t>401(k) Enrollment and Employ Gate 2</w:t>
-            </w:r>
-          </w:p>
-        </w:tc>
-        <w:tc>
-          <w:tcPr>
-            <w:tcW w:type="dxa" w:w="2160"/>
-          </w:tcPr>
-          <w:p>
-            <w:r>
-              <w:t>Sam Whitfield</w:t>
-            </w:r>
-          </w:p>
-        </w:tc>
-        <w:tc>
-          <w:tcPr>
-            <w:tcW w:type="dxa" w:w="2160"/>
-          </w:tcPr>
-          <w:p>
-            <w:r>
-              <w:t>10 business days</w:t>
-            </w:r>
-          </w:p>
-        </w:tc>
-        <w:tc>
-          <w:tcPr>
-            <w:tcW w:type="dxa" w:w="2160"/>
-          </w:tcPr>
-          <w:p>
-            <w:r>
-              <w:t>Monitored</w:t>
-            </w:r>
-          </w:p>
-        </w:tc>
-      </w:tr>
-      <w:tr>
-        <w:tc>
-          <w:tcPr>
-            <w:tcW w:type="dxa" w:w="2160"/>
-          </w:tcPr>
-          <w:p>
-            <w:r>
-              <w:t>Sec-6</w:t>
-            </w:r>
-          </w:p>
-        </w:tc>
-        <w:tc>
-          <w:tcPr>
-            <w:tcW w:type="dxa" w:w="2160"/>
-          </w:tcPr>
-          <w:p>
-            <w:r>
-              <w:t>Sam Whitfield</w:t>
-            </w:r>
-          </w:p>
-        </w:tc>
-        <w:tc>
-          <w:tcPr>
-            <w:tcW w:type="dxa" w:w="2160"/>
-          </w:tcPr>
-          <w:p>
-            <w:r>
-              <w:t>10 business days</w:t>
-            </w:r>
-          </w:p>
-        </w:tc>
-        <w:tc>
-          <w:tcPr>
-            <w:tcW w:type="dxa" w:w="2160"/>
-          </w:tcPr>
-          <w:p>
-            <w:r>
-              <w:t>Stage 6 Verified</w:t>
-            </w:r>
-          </w:p>
-        </w:tc>
-      </w:tr>
-    </w:tbl>
-    <w:p>
-      <w:r>
-        <w:drawing>
-          <wp:inline xmlns:a="http://schemas.openxmlformats.org/drawingml/2006/main" xmlns:pic="http://schemas.openxmlformats.org/drawingml/2006/picture">
-            <wp:extent cx="5303520" cy="1744579"/>
-            <wp:docPr id="3" name="Picture 3"/>
-            <wp:cNvGraphicFramePr>
-              <a:graphicFrameLocks noChangeAspect="1"/>
-            </wp:cNvGraphicFramePr>
-            <a:graphic>
-              <a:graphicData uri="http://schemas.openxmlformats.org/drawingml/2006/picture">
-                <pic:pic>
-                  <pic:nvPicPr>
-                    <pic:cNvPr id="0" name="image.png"/>
-                    <pic:cNvPicPr/>
-                  </pic:nvPicPr>
-                  <pic:blipFill>
-                    <a:blip r:embed="rId9"/>
-                    <a:stretch>
-                      <a:fillRect/>
-                    </a:stretch>
-                  </pic:blipFill>
-                  <pic:spPr>
-                    <a:xfrm>
-                      <a:off x="0" y="0"/>
-                      <a:ext cx="5303520" cy="1744579"/>
-                    </a:xfrm>
-                    <a:prstGeom prst="rect"/>
-                  </pic:spPr>
-                </pic:pic>
-              </a:graphicData>
-            </a:graphic>
-          </wp:inline>
-        </w:drawing>
-      </w:r>
-    </w:p>
-    <w:p>
-      <w:r>
-        <w:rPr>
-          <w:color w:val="808080"/>
-          <w:sz w:val="16"/>
-        </w:rPr>
-        <w:t>Page 6 of 12 | HR Knowledge Hub | Compensation and Benefits | SharePoint Online</w:t>
-      </w:r>
-    </w:p>
-    <w:p>
-      <w:r>
-        <w:br w:type="page"/>
-      </w:r>
-    </w:p>
-    <w:p>
-      <w:pPr>
-        <w:pStyle w:val="Heading1"/>
-      </w:pPr>
-      <w:r>
-        <w:t>Section 7: Risk Register &amp; Mitigations</w:t>
-      </w:r>
-    </w:p>
-    <w:p>
-      <w:r>
-        <w:t>Explains automatic enrollment defaults, the employer match formula, and vesting schedule for retirement contributions. Section 7 (Risk Register &amp; Mitigations) applies to Compensation and Benefits within HR Knowledge Hub and is maintained by Sam Whitfield. Catalogs operational, compliance, and delivery risks alongside preventive mitigations.</w:t>
-      </w:r>
-    </w:p>
-    <w:p>
-      <w:r>
-        <w:t>Operational requirement 7.1: Employer match vests over four years on a graded schedule. Secondary control 7.2: Loans against the 401(k) balance are limited to 50% of vested balance.</w:t>
-      </w:r>
-    </w:p>
-    <w:p>
-      <w:pPr>
-        <w:pStyle w:val="ListBullet"/>
-      </w:pPr>
-      <w:r>
-        <w:t>Employer match vests over four years on a graded schedule.</w:t>
-      </w:r>
-    </w:p>
-    <w:p>
-      <w:pPr>
-        <w:pStyle w:val="ListBullet"/>
-      </w:pPr>
-      <w:r>
-        <w:t>Loans against the 401(k) balance are limited to 50% of vested balance.</w:t>
-      </w:r>
-    </w:p>
-    <w:p>
-      <w:pPr>
-        <w:pStyle w:val="ListBullet"/>
-      </w:pPr>
-      <w:r>
-        <w:t>Section 7 review cadence is tracked by Sam Whitfield under Compensation and Benefits governance.</w:t>
-      </w:r>
-    </w:p>
-    <w:tbl>
-      <w:tblPr>
-        <w:tblStyle w:val="LightGrid-Accent1"/>
-        <w:tblW w:type="auto" w:w="0"/>
-        <w:tblLook w:firstColumn="1" w:firstRow="1" w:lastColumn="0" w:lastRow="0" w:noHBand="0" w:noVBand="1" w:val="04A0"/>
-      </w:tblPr>
-      <w:tblGrid>
-        <w:gridCol w:w="2160"/>
-        <w:gridCol w:w="2160"/>
-        <w:gridCol w:w="2160"/>
-        <w:gridCol w:w="2160"/>
-      </w:tblGrid>
-      <w:tr>
-        <w:tc>
-          <w:tcPr>
-            <w:tcW w:type="dxa" w:w="2160"/>
-          </w:tcPr>
-          <w:p>
-            <w:r>
-              <w:rPr>
-                <w:b/>
-              </w:rPr>
-              <w:t>Control Area</w:t>
-            </w:r>
-          </w:p>
-        </w:tc>
-        <w:tc>
-          <w:tcPr>
-            <w:tcW w:type="dxa" w:w="2160"/>
-          </w:tcPr>
-          <w:p>
-            <w:r>
-              <w:rPr>
-                <w:b/>
-              </w:rPr>
-              <w:t>Owner</w:t>
-            </w:r>
-          </w:p>
-        </w:tc>
-        <w:tc>
-          <w:tcPr>
-            <w:tcW w:type="dxa" w:w="2160"/>
-          </w:tcPr>
-          <w:p>
-            <w:r>
-              <w:rPr>
-                <w:b/>
-              </w:rPr>
-              <w:t>Target SLA</w:t>
-            </w:r>
-          </w:p>
-        </w:tc>
-        <w:tc>
-          <w:tcPr>
-            <w:tcW w:type="dxa" w:w="2160"/>
-          </w:tcPr>
-          <w:p>
-            <w:r>
-              <w:rPr>
-                <w:b/>
-              </w:rPr>
-              <w:t>Verification Status</w:t>
-            </w:r>
-          </w:p>
-        </w:tc>
-      </w:tr>
-      <w:tr>
-        <w:tc>
-          <w:tcPr>
-            <w:tcW w:type="dxa" w:w="2160"/>
-          </w:tcPr>
-          <w:p>
-            <w:r>
-              <w:t>Compensation and Benefits</w:t>
-            </w:r>
-          </w:p>
-        </w:tc>
-        <w:tc>
-          <w:tcPr>
-            <w:tcW w:type="dxa" w:w="2160"/>
-          </w:tcPr>
-          <w:p>
-            <w:r>
-              <w:t>Sam Whitfield</w:t>
-            </w:r>
-          </w:p>
-        </w:tc>
-        <w:tc>
-          <w:tcPr>
-            <w:tcW w:type="dxa" w:w="2160"/>
-          </w:tcPr>
-          <w:p>
-            <w:r>
-              <w:t>5 business days</w:t>
-            </w:r>
-          </w:p>
-        </w:tc>
-        <w:tc>
-          <w:tcPr>
-            <w:tcW w:type="dxa" w:w="2160"/>
-          </w:tcPr>
-          <w:p>
-            <w:r>
-              <w:t>Verified</w:t>
-            </w:r>
-          </w:p>
-        </w:tc>
-      </w:tr>
-      <w:tr>
-        <w:tc>
-          <w:tcPr>
-            <w:tcW w:type="dxa" w:w="2160"/>
-          </w:tcPr>
-          <w:p>
-            <w:r>
-              <w:t>401(k) Enrollment and Employ Gate 1</w:t>
-            </w:r>
-          </w:p>
-        </w:tc>
-        <w:tc>
-          <w:tcPr>
-            <w:tcW w:type="dxa" w:w="2160"/>
-          </w:tcPr>
-          <w:p>
-            <w:r>
-              <w:t>Sam Whitfield</w:t>
-            </w:r>
-          </w:p>
-        </w:tc>
-        <w:tc>
-          <w:tcPr>
-            <w:tcW w:type="dxa" w:w="2160"/>
-          </w:tcPr>
-          <w:p>
-            <w:r>
-              <w:t>3 business days</w:t>
-            </w:r>
-          </w:p>
-        </w:tc>
-        <w:tc>
-          <w:tcPr>
-            <w:tcW w:type="dxa" w:w="2160"/>
-          </w:tcPr>
-          <w:p>
-            <w:r>
-              <w:t>Active</w:t>
-            </w:r>
-          </w:p>
-        </w:tc>
-      </w:tr>
-      <w:tr>
-        <w:tc>
-          <w:tcPr>
-            <w:tcW w:type="dxa" w:w="2160"/>
-          </w:tcPr>
-          <w:p>
-            <w:r>
-              <w:t>401(k) Enrollment and Employ Gate 2</w:t>
-            </w:r>
-          </w:p>
-        </w:tc>
-        <w:tc>
-          <w:tcPr>
-            <w:tcW w:type="dxa" w:w="2160"/>
-          </w:tcPr>
-          <w:p>
-            <w:r>
-              <w:t>Sam Whitfield</w:t>
-            </w:r>
-          </w:p>
-        </w:tc>
-        <w:tc>
-          <w:tcPr>
-            <w:tcW w:type="dxa" w:w="2160"/>
-          </w:tcPr>
-          <w:p>
-            <w:r>
-              <w:t>10 business days</w:t>
-            </w:r>
-          </w:p>
-        </w:tc>
-        <w:tc>
-          <w:tcPr>
-            <w:tcW w:type="dxa" w:w="2160"/>
-          </w:tcPr>
-          <w:p>
-            <w:r>
-              <w:t>Monitored</w:t>
-            </w:r>
-          </w:p>
-        </w:tc>
-      </w:tr>
-      <w:tr>
-        <w:tc>
-          <w:tcPr>
-            <w:tcW w:type="dxa" w:w="2160"/>
-          </w:tcPr>
-          <w:p>
-            <w:r>
-              <w:t>Sec-7</w:t>
-            </w:r>
-          </w:p>
-        </w:tc>
-        <w:tc>
-          <w:tcPr>
-            <w:tcW w:type="dxa" w:w="2160"/>
-          </w:tcPr>
-          <w:p>
-            <w:r>
-              <w:t>Sam Whitfield</w:t>
-            </w:r>
-          </w:p>
-        </w:tc>
-        <w:tc>
-          <w:tcPr>
-            <w:tcW w:type="dxa" w:w="2160"/>
-          </w:tcPr>
-          <w:p>
-            <w:r>
-              <w:t>5 business days</w:t>
-            </w:r>
-          </w:p>
-        </w:tc>
-        <w:tc>
-          <w:tcPr>
-            <w:tcW w:type="dxa" w:w="2160"/>
-          </w:tcPr>
-          <w:p>
-            <w:r>
-              <w:t>Stage 7 Verified</w:t>
-            </w:r>
-          </w:p>
-        </w:tc>
-      </w:tr>
-    </w:tbl>
-    <w:p>
-      <w:r>
-        <w:rPr>
-          <w:color w:val="808080"/>
-          <w:sz w:val="16"/>
-        </w:rPr>
-        <w:t>Page 7 of 12 | HR Knowledge Hub | Compensation and Benefits | SharePoint Online</w:t>
-      </w:r>
-    </w:p>
-    <w:p>
-      <w:r>
-        <w:br w:type="page"/>
-      </w:r>
-    </w:p>
-    <w:p>
-      <w:pPr>
-        <w:pStyle w:val="Heading1"/>
-      </w:pPr>
-      <w:r>
-        <w:t>Section 8: Quality Assurance &amp; Audits</w:t>
-      </w:r>
-    </w:p>
-    <w:p>
-      <w:r>
-        <w:t>Explains automatic enrollment defaults, the employer match formula, and vesting schedule for retirement contributions. Section 8 (Quality Assurance &amp; Audits) applies to Compensation and Benefits within HR Knowledge Hub and is maintained by Sam Whitfield. Specifies sampling frequencies, inspection tolerances, and nonconformance workflows.</w:t>
-      </w:r>
-    </w:p>
-    <w:p>
-      <w:r>
-        <w:t>Operational requirement 8.1: Loans against the 401(k) balance are limited to 50% of vested balance. Secondary control 8.2: New hires are auto-enrolled at 4% contribution after 30 days unless they opt out.</w:t>
-      </w:r>
-    </w:p>
-    <w:p>
-      <w:pPr>
-        <w:pStyle w:val="ListBullet"/>
-      </w:pPr>
-      <w:r>
-        <w:t>Loans against the 401(k) balance are limited to 50% of vested balance.</w:t>
-      </w:r>
-    </w:p>
-    <w:p>
-      <w:pPr>
-        <w:pStyle w:val="ListBullet"/>
-      </w:pPr>
-      <w:r>
-        <w:t>New hires are auto-enrolled at 4% contribution after 30 days unless they opt out.</w:t>
-      </w:r>
-    </w:p>
-    <w:p>
-      <w:pPr>
-        <w:pStyle w:val="ListBullet"/>
-      </w:pPr>
-      <w:r>
-        <w:t>Section 8 review cadence is tracked by Sam Whitfield under Compensation and Benefits governance.</w:t>
-      </w:r>
-    </w:p>
-    <w:tbl>
-      <w:tblPr>
-        <w:tblStyle w:val="LightGrid-Accent1"/>
-        <w:tblW w:type="auto" w:w="0"/>
-        <w:tblLook w:firstColumn="1" w:firstRow="1" w:lastColumn="0" w:lastRow="0" w:noHBand="0" w:noVBand="1" w:val="04A0"/>
-      </w:tblPr>
-      <w:tblGrid>
-        <w:gridCol w:w="2160"/>
-        <w:gridCol w:w="2160"/>
-        <w:gridCol w:w="2160"/>
-        <w:gridCol w:w="2160"/>
-      </w:tblGrid>
-      <w:tr>
-        <w:tc>
-          <w:tcPr>
-            <w:tcW w:type="dxa" w:w="2160"/>
-          </w:tcPr>
-          <w:p>
-            <w:r>
-              <w:rPr>
-                <w:b/>
-              </w:rPr>
-              <w:t>Control Area</w:t>
-            </w:r>
-          </w:p>
-        </w:tc>
-        <w:tc>
-          <w:tcPr>
-            <w:tcW w:type="dxa" w:w="2160"/>
-          </w:tcPr>
-          <w:p>
-            <w:r>
-              <w:rPr>
-                <w:b/>
-              </w:rPr>
-              <w:t>Owner</w:t>
-            </w:r>
-          </w:p>
-        </w:tc>
-        <w:tc>
-          <w:tcPr>
-            <w:tcW w:type="dxa" w:w="2160"/>
-          </w:tcPr>
-          <w:p>
-            <w:r>
-              <w:rPr>
-                <w:b/>
-              </w:rPr>
-              <w:t>Target SLA</w:t>
-            </w:r>
-          </w:p>
-        </w:tc>
-        <w:tc>
-          <w:tcPr>
-            <w:tcW w:type="dxa" w:w="2160"/>
-          </w:tcPr>
-          <w:p>
-            <w:r>
-              <w:rPr>
-                <w:b/>
-              </w:rPr>
-              <w:t>Verification Status</w:t>
-            </w:r>
-          </w:p>
-        </w:tc>
-      </w:tr>
-      <w:tr>
-        <w:tc>
-          <w:tcPr>
-            <w:tcW w:type="dxa" w:w="2160"/>
-          </w:tcPr>
-          <w:p>
-            <w:r>
-              <w:t>Compensation and Benefits</w:t>
-            </w:r>
-          </w:p>
-        </w:tc>
-        <w:tc>
-          <w:tcPr>
-            <w:tcW w:type="dxa" w:w="2160"/>
-          </w:tcPr>
-          <w:p>
-            <w:r>
-              <w:t>Sam Whitfield</w:t>
-            </w:r>
-          </w:p>
-        </w:tc>
-        <w:tc>
-          <w:tcPr>
-            <w:tcW w:type="dxa" w:w="2160"/>
-          </w:tcPr>
-          <w:p>
-            <w:r>
-              <w:t>5 business days</w:t>
-            </w:r>
-          </w:p>
-        </w:tc>
-        <w:tc>
-          <w:tcPr>
-            <w:tcW w:type="dxa" w:w="2160"/>
-          </w:tcPr>
-          <w:p>
-            <w:r>
-              <w:t>Verified</w:t>
-            </w:r>
-          </w:p>
-        </w:tc>
-      </w:tr>
-      <w:tr>
-        <w:tc>
-          <w:tcPr>
-            <w:tcW w:type="dxa" w:w="2160"/>
-          </w:tcPr>
-          <w:p>
-            <w:r>
-              <w:t>401(k) Enrollment and Employ Gate 1</w:t>
-            </w:r>
-          </w:p>
-        </w:tc>
-        <w:tc>
-          <w:tcPr>
-            <w:tcW w:type="dxa" w:w="2160"/>
-          </w:tcPr>
-          <w:p>
-            <w:r>
-              <w:t>Sam Whitfield</w:t>
-            </w:r>
-          </w:p>
-        </w:tc>
-        <w:tc>
-          <w:tcPr>
-            <w:tcW w:type="dxa" w:w="2160"/>
-          </w:tcPr>
-          <w:p>
-            <w:r>
-              <w:t>3 business days</w:t>
-            </w:r>
-          </w:p>
-        </w:tc>
-        <w:tc>
-          <w:tcPr>
-            <w:tcW w:type="dxa" w:w="2160"/>
-          </w:tcPr>
-          <w:p>
-            <w:r>
-              <w:t>Active</w:t>
-            </w:r>
-          </w:p>
-        </w:tc>
-      </w:tr>
-      <w:tr>
-        <w:tc>
-          <w:tcPr>
-            <w:tcW w:type="dxa" w:w="2160"/>
-          </w:tcPr>
-          <w:p>
-            <w:r>
-              <w:t>401(k) Enrollment and Employ Gate 2</w:t>
-            </w:r>
-          </w:p>
-        </w:tc>
-        <w:tc>
-          <w:tcPr>
-            <w:tcW w:type="dxa" w:w="2160"/>
-          </w:tcPr>
-          <w:p>
-            <w:r>
-              <w:t>Sam Whitfield</w:t>
-            </w:r>
-          </w:p>
-        </w:tc>
-        <w:tc>
-          <w:tcPr>
-            <w:tcW w:type="dxa" w:w="2160"/>
-          </w:tcPr>
-          <w:p>
-            <w:r>
-              <w:t>10 business days</w:t>
-            </w:r>
-          </w:p>
-        </w:tc>
-        <w:tc>
-          <w:tcPr>
-            <w:tcW w:type="dxa" w:w="2160"/>
-          </w:tcPr>
-          <w:p>
-            <w:r>
-              <w:t>Monitored</w:t>
-            </w:r>
-          </w:p>
-        </w:tc>
-      </w:tr>
-      <w:tr>
-        <w:tc>
-          <w:tcPr>
-            <w:tcW w:type="dxa" w:w="2160"/>
-          </w:tcPr>
-          <w:p>
-            <w:r>
-              <w:t>Sec-8</w:t>
-            </w:r>
-          </w:p>
-        </w:tc>
-        <w:tc>
-          <w:tcPr>
-            <w:tcW w:type="dxa" w:w="2160"/>
-          </w:tcPr>
-          <w:p>
-            <w:r>
-              <w:t>Sam Whitfield</w:t>
-            </w:r>
-          </w:p>
-        </w:tc>
-        <w:tc>
-          <w:tcPr>
-            <w:tcW w:type="dxa" w:w="2160"/>
-          </w:tcPr>
-          <w:p>
-            <w:r>
-              <w:t>3 business days</w:t>
-            </w:r>
-          </w:p>
-        </w:tc>
-        <w:tc>
-          <w:tcPr>
-            <w:tcW w:type="dxa" w:w="2160"/>
-          </w:tcPr>
-          <w:p>
-            <w:r>
-              <w:t>Stage 8 Verified</w:t>
-            </w:r>
-          </w:p>
-        </w:tc>
-      </w:tr>
-    </w:tbl>
-    <w:p>
-      <w:r>
-        <w:drawing>
-          <wp:inline xmlns:a="http://schemas.openxmlformats.org/drawingml/2006/main" xmlns:pic="http://schemas.openxmlformats.org/drawingml/2006/picture">
-            <wp:extent cx="5303520" cy="1744579"/>
-            <wp:docPr id="4" name="Picture 4"/>
-            <wp:cNvGraphicFramePr>
-              <a:graphicFrameLocks noChangeAspect="1"/>
-            </wp:cNvGraphicFramePr>
-            <a:graphic>
-              <a:graphicData uri="http://schemas.openxmlformats.org/drawingml/2006/picture">
-                <pic:pic>
-                  <pic:nvPicPr>
-                    <pic:cNvPr id="0" name="image.png"/>
-                    <pic:cNvPicPr/>
-                  </pic:nvPicPr>
-                  <pic:blipFill>
-                    <a:blip r:embed="rId10"/>
-                    <a:stretch>
-                      <a:fillRect/>
-                    </a:stretch>
-                  </pic:blipFill>
-                  <pic:spPr>
-                    <a:xfrm>
-                      <a:off x="0" y="0"/>
-                      <a:ext cx="5303520" cy="1744579"/>
-                    </a:xfrm>
-                    <a:prstGeom prst="rect"/>
-                  </pic:spPr>
-                </pic:pic>
-              </a:graphicData>
-            </a:graphic>
-          </wp:inline>
-        </w:drawing>
-      </w:r>
-    </w:p>
-    <w:p>
-      <w:r>
-        <w:rPr>
-          <w:color w:val="808080"/>
-          <w:sz w:val="16"/>
-        </w:rPr>
-        <w:t>Page 8 of 12 | HR Knowledge Hub | Compensation and Benefits | SharePoint Online</w:t>
-      </w:r>
-    </w:p>
-    <w:p>
-      <w:r>
-        <w:br w:type="page"/>
-      </w:r>
-    </w:p>
-    <w:p>
-      <w:pPr>
-        <w:pStyle w:val="Heading1"/>
-      </w:pPr>
-      <w:r>
-        <w:t>Section 9: Exception Handling &amp; Escalations</w:t>
-      </w:r>
-    </w:p>
-    <w:p>
-      <w:r>
-        <w:t>Explains automatic enrollment defaults, the employer match formula, and vesting schedule for retirement contributions. Section 9 (Exception Handling &amp; Escalations) applies to Compensation and Benefits within HR Knowledge Hub and is maintained by Sam Whitfield. Outlines severity tiers, response SLAs, and cross-functional escalation paths.</w:t>
-      </w:r>
-    </w:p>
-    <w:p>
-      <w:r>
-        <w:t>Operational requirement 9.1: New hires are auto-enrolled at 4% contribution after 30 days unless they opt out. Secondary control 9.2: Employer matches 50% of the first 6% an employee contributes.</w:t>
-      </w:r>
-    </w:p>
-    <w:p>
-      <w:pPr>
-        <w:pStyle w:val="ListBullet"/>
-      </w:pPr>
-      <w:r>
-        <w:t>New hires are auto-enrolled at 4% contribution after 30 days unless they opt out.</w:t>
-      </w:r>
-    </w:p>
-    <w:p>
-      <w:pPr>
-        <w:pStyle w:val="ListBullet"/>
-      </w:pPr>
-      <w:r>
-        <w:t>Employer matches 50% of the first 6% an employee contributes.</w:t>
-      </w:r>
-    </w:p>
-    <w:p>
-      <w:pPr>
-        <w:pStyle w:val="ListBullet"/>
-      </w:pPr>
-      <w:r>
-        <w:t>Section 9 review cadence is tracked by Sam Whitfield under Compensation and Benefits governance.</w:t>
-      </w:r>
-    </w:p>
-    <w:tbl>
-      <w:tblPr>
-        <w:tblStyle w:val="LightGrid-Accent1"/>
-        <w:tblW w:type="auto" w:w="0"/>
-        <w:tblLook w:firstColumn="1" w:firstRow="1" w:lastColumn="0" w:lastRow="0" w:noHBand="0" w:noVBand="1" w:val="04A0"/>
-      </w:tblPr>
-      <w:tblGrid>
-        <w:gridCol w:w="2160"/>
-        <w:gridCol w:w="2160"/>
-        <w:gridCol w:w="2160"/>
-        <w:gridCol w:w="2160"/>
-      </w:tblGrid>
-      <w:tr>
-        <w:tc>
-          <w:tcPr>
-            <w:tcW w:type="dxa" w:w="2160"/>
-          </w:tcPr>
-          <w:p>
-            <w:r>
-              <w:rPr>
-                <w:b/>
-              </w:rPr>
-              <w:t>Control Area</w:t>
-            </w:r>
-          </w:p>
-        </w:tc>
-        <w:tc>
-          <w:tcPr>
-            <w:tcW w:type="dxa" w:w="2160"/>
-          </w:tcPr>
-          <w:p>
-            <w:r>
-              <w:rPr>
-                <w:b/>
-              </w:rPr>
-              <w:t>Owner</w:t>
-            </w:r>
-          </w:p>
-        </w:tc>
-        <w:tc>
-          <w:tcPr>
-            <w:tcW w:type="dxa" w:w="2160"/>
-          </w:tcPr>
-          <w:p>
-            <w:r>
-              <w:rPr>
-                <w:b/>
-              </w:rPr>
-              <w:t>Target SLA</w:t>
-            </w:r>
-          </w:p>
-        </w:tc>
-        <w:tc>
-          <w:tcPr>
-            <w:tcW w:type="dxa" w:w="2160"/>
-          </w:tcPr>
-          <w:p>
-            <w:r>
-              <w:rPr>
-                <w:b/>
-              </w:rPr>
-              <w:t>Verification Status</w:t>
-            </w:r>
-          </w:p>
-        </w:tc>
-      </w:tr>
-      <w:tr>
-        <w:tc>
-          <w:tcPr>
-            <w:tcW w:type="dxa" w:w="2160"/>
-          </w:tcPr>
-          <w:p>
-            <w:r>
-              <w:t>Compensation and Benefits</w:t>
-            </w:r>
-          </w:p>
-        </w:tc>
-        <w:tc>
-          <w:tcPr>
-            <w:tcW w:type="dxa" w:w="2160"/>
-          </w:tcPr>
-          <w:p>
-            <w:r>
-              <w:t>Sam Whitfield</w:t>
-            </w:r>
-          </w:p>
-        </w:tc>
-        <w:tc>
-          <w:tcPr>
-            <w:tcW w:type="dxa" w:w="2160"/>
-          </w:tcPr>
-          <w:p>
-            <w:r>
-              <w:t>5 business days</w:t>
-            </w:r>
-          </w:p>
-        </w:tc>
-        <w:tc>
-          <w:tcPr>
-            <w:tcW w:type="dxa" w:w="2160"/>
-          </w:tcPr>
-          <w:p>
-            <w:r>
-              <w:t>Verified</w:t>
-            </w:r>
-          </w:p>
-        </w:tc>
-      </w:tr>
-      <w:tr>
-        <w:tc>
-          <w:tcPr>
-            <w:tcW w:type="dxa" w:w="2160"/>
-          </w:tcPr>
-          <w:p>
-            <w:r>
-              <w:t>401(k) Enrollment and Employ Gate 1</w:t>
-            </w:r>
-          </w:p>
-        </w:tc>
-        <w:tc>
-          <w:tcPr>
-            <w:tcW w:type="dxa" w:w="2160"/>
-          </w:tcPr>
-          <w:p>
-            <w:r>
-              <w:t>Sam Whitfield</w:t>
-            </w:r>
-          </w:p>
-        </w:tc>
-        <w:tc>
-          <w:tcPr>
-            <w:tcW w:type="dxa" w:w="2160"/>
-          </w:tcPr>
-          <w:p>
-            <w:r>
-              <w:t>3 business days</w:t>
-            </w:r>
-          </w:p>
-        </w:tc>
-        <w:tc>
-          <w:tcPr>
-            <w:tcW w:type="dxa" w:w="2160"/>
-          </w:tcPr>
-          <w:p>
-            <w:r>
-              <w:t>Active</w:t>
-            </w:r>
-          </w:p>
-        </w:tc>
-      </w:tr>
-      <w:tr>
-        <w:tc>
-          <w:tcPr>
-            <w:tcW w:type="dxa" w:w="2160"/>
-          </w:tcPr>
-          <w:p>
-            <w:r>
-              <w:t>401(k) Enrollment and Employ Gate 2</w:t>
-            </w:r>
-          </w:p>
-        </w:tc>
-        <w:tc>
-          <w:tcPr>
-            <w:tcW w:type="dxa" w:w="2160"/>
-          </w:tcPr>
-          <w:p>
-            <w:r>
-              <w:t>Sam Whitfield</w:t>
-            </w:r>
-          </w:p>
-        </w:tc>
-        <w:tc>
-          <w:tcPr>
-            <w:tcW w:type="dxa" w:w="2160"/>
-          </w:tcPr>
-          <w:p>
-            <w:r>
-              <w:t>10 business days</w:t>
-            </w:r>
-          </w:p>
-        </w:tc>
-        <w:tc>
-          <w:tcPr>
-            <w:tcW w:type="dxa" w:w="2160"/>
-          </w:tcPr>
-          <w:p>
-            <w:r>
-              <w:t>Monitored</w:t>
-            </w:r>
-          </w:p>
-        </w:tc>
-      </w:tr>
-      <w:tr>
-        <w:tc>
-          <w:tcPr>
-            <w:tcW w:type="dxa" w:w="2160"/>
-          </w:tcPr>
-          <w:p>
-            <w:r>
-              <w:t>Sec-9</w:t>
-            </w:r>
-          </w:p>
-        </w:tc>
-        <w:tc>
-          <w:tcPr>
-            <w:tcW w:type="dxa" w:w="2160"/>
-          </w:tcPr>
-          <w:p>
-            <w:r>
-              <w:t>Sam Whitfield</w:t>
-            </w:r>
-          </w:p>
-        </w:tc>
-        <w:tc>
-          <w:tcPr>
-            <w:tcW w:type="dxa" w:w="2160"/>
-          </w:tcPr>
-          <w:p>
-            <w:r>
-              <w:t>10 business days</w:t>
-            </w:r>
-          </w:p>
-        </w:tc>
-        <w:tc>
-          <w:tcPr>
-            <w:tcW w:type="dxa" w:w="2160"/>
-          </w:tcPr>
-          <w:p>
-            <w:r>
-              <w:t>Stage 9 Verified</w:t>
-            </w:r>
-          </w:p>
-        </w:tc>
-      </w:tr>
-    </w:tbl>
-    <w:p>
-      <w:r>
-        <w:drawing>
-          <wp:inline xmlns:a="http://schemas.openxmlformats.org/drawingml/2006/main" xmlns:pic="http://schemas.openxmlformats.org/drawingml/2006/picture">
-            <wp:extent cx="5303520" cy="1744579"/>
-            <wp:docPr id="5" name="Picture 5"/>
-            <wp:cNvGraphicFramePr>
-              <a:graphicFrameLocks noChangeAspect="1"/>
-            </wp:cNvGraphicFramePr>
-            <a:graphic>
-              <a:graphicData uri="http://schemas.openxmlformats.org/drawingml/2006/picture">
-                <pic:pic>
-                  <pic:nvPicPr>
-                    <pic:cNvPr id="0" name="image.png"/>
-                    <pic:cNvPicPr/>
-                  </pic:nvPicPr>
-                  <pic:blipFill>
-                    <a:blip r:embed="rId9"/>
-                    <a:stretch>
-                      <a:fillRect/>
-                    </a:stretch>
-                  </pic:blipFill>
-                  <pic:spPr>
-                    <a:xfrm>
-                      <a:off x="0" y="0"/>
-                      <a:ext cx="5303520" cy="1744579"/>
-                    </a:xfrm>
-                    <a:prstGeom prst="rect"/>
-                  </pic:spPr>
-                </pic:pic>
-              </a:graphicData>
-            </a:graphic>
-          </wp:inline>
-        </w:drawing>
-      </w:r>
-    </w:p>
-    <w:p>
-      <w:r>
-        <w:rPr>
-          <w:color w:val="808080"/>
-          <w:sz w:val="16"/>
-        </w:rPr>
-        <w:t>Page 9 of 12 | HR Knowledge Hub | Compensation and Benefits | SharePoint Online</w:t>
-      </w:r>
-    </w:p>
-    <w:p>
-      <w:r>
-        <w:br w:type="page"/>
-      </w:r>
-    </w:p>
-    <w:p>
-      <w:pPr>
-        <w:pStyle w:val="Heading1"/>
-      </w:pPr>
-      <w:r>
-        <w:t>Section 10: Cross-Functional Dependencies</w:t>
-      </w:r>
-    </w:p>
-    <w:p>
-      <w:r>
-        <w:t>Explains automatic enrollment defaults, the employer match formula, and vesting schedule for retirement contributions. Section 10 (Cross-Functional Dependencies) applies to Compensation and Benefits within HR Knowledge Hub and is maintained by Sam Whitfield. Documents upstream and downstream team dependencies and service-level commitments.</w:t>
-      </w:r>
-    </w:p>
-    <w:p>
-      <w:r>
-        <w:t>Operational requirement 10.1: Employer matches 50% of the first 6% an employee contributes. Secondary control 10.2: Employer match vests over four years on a graded schedule.</w:t>
-      </w:r>
-    </w:p>
-    <w:p>
-      <w:pPr>
-        <w:pStyle w:val="ListBullet"/>
-      </w:pPr>
-      <w:r>
-        <w:t>Employer matches 50% of the first 6% an employee contributes.</w:t>
-      </w:r>
-    </w:p>
-    <w:p>
-      <w:pPr>
-        <w:pStyle w:val="ListBullet"/>
-      </w:pPr>
-      <w:r>
-        <w:t>Employer match vests over four years on a graded schedule.</w:t>
-      </w:r>
-    </w:p>
-    <w:p>
-      <w:pPr>
-        <w:pStyle w:val="ListBullet"/>
-      </w:pPr>
-      <w:r>
-        <w:t>Section 10 review cadence is tracked by Sam Whitfield under Compensation and Benefits governance.</w:t>
-      </w:r>
-    </w:p>
-    <w:tbl>
-      <w:tblPr>
-        <w:tblStyle w:val="LightGrid-Accent1"/>
-        <w:tblW w:type="auto" w:w="0"/>
-        <w:tblLook w:firstColumn="1" w:firstRow="1" w:lastColumn="0" w:lastRow="0" w:noHBand="0" w:noVBand="1" w:val="04A0"/>
-      </w:tblPr>
-      <w:tblGrid>
-        <w:gridCol w:w="2160"/>
-        <w:gridCol w:w="2160"/>
-        <w:gridCol w:w="2160"/>
-        <w:gridCol w:w="2160"/>
-      </w:tblGrid>
-      <w:tr>
-        <w:tc>
-          <w:tcPr>
-            <w:tcW w:type="dxa" w:w="2160"/>
-          </w:tcPr>
-          <w:p>
-            <w:r>
-              <w:rPr>
-                <w:b/>
-              </w:rPr>
-              <w:t>Control Area</w:t>
-            </w:r>
-          </w:p>
-        </w:tc>
-        <w:tc>
-          <w:tcPr>
-            <w:tcW w:type="dxa" w:w="2160"/>
-          </w:tcPr>
-          <w:p>
-            <w:r>
-              <w:rPr>
-                <w:b/>
-              </w:rPr>
-              <w:t>Owner</w:t>
-            </w:r>
-          </w:p>
-        </w:tc>
-        <w:tc>
-          <w:tcPr>
-            <w:tcW w:type="dxa" w:w="2160"/>
-          </w:tcPr>
-          <w:p>
-            <w:r>
-              <w:rPr>
-                <w:b/>
-              </w:rPr>
-              <w:t>Target SLA</w:t>
-            </w:r>
-          </w:p>
-        </w:tc>
-        <w:tc>
-          <w:tcPr>
-            <w:tcW w:type="dxa" w:w="2160"/>
-          </w:tcPr>
-          <w:p>
-            <w:r>
-              <w:rPr>
-                <w:b/>
-              </w:rPr>
-              <w:t>Verification Status</w:t>
-            </w:r>
-          </w:p>
-        </w:tc>
-      </w:tr>
-      <w:tr>
-        <w:tc>
-          <w:tcPr>
-            <w:tcW w:type="dxa" w:w="2160"/>
-          </w:tcPr>
-          <w:p>
-            <w:r>
-              <w:t>Compensation and Benefits</w:t>
-            </w:r>
-          </w:p>
-        </w:tc>
-        <w:tc>
-          <w:tcPr>
-            <w:tcW w:type="dxa" w:w="2160"/>
-          </w:tcPr>
-          <w:p>
-            <w:r>
-              <w:t>Sam Whitfield</w:t>
-            </w:r>
-          </w:p>
-        </w:tc>
-        <w:tc>
-          <w:tcPr>
-            <w:tcW w:type="dxa" w:w="2160"/>
-          </w:tcPr>
-          <w:p>
-            <w:r>
-              <w:t>5 business days</w:t>
-            </w:r>
-          </w:p>
-        </w:tc>
-        <w:tc>
-          <w:tcPr>
-            <w:tcW w:type="dxa" w:w="2160"/>
-          </w:tcPr>
-          <w:p>
-            <w:r>
-              <w:t>Verified</w:t>
-            </w:r>
-          </w:p>
-        </w:tc>
-      </w:tr>
-      <w:tr>
-        <w:tc>
-          <w:tcPr>
-            <w:tcW w:type="dxa" w:w="2160"/>
-          </w:tcPr>
-          <w:p>
-            <w:r>
-              <w:t>401(k) Enrollment and Employ Gate 1</w:t>
-            </w:r>
-          </w:p>
-        </w:tc>
-        <w:tc>
-          <w:tcPr>
-            <w:tcW w:type="dxa" w:w="2160"/>
-          </w:tcPr>
-          <w:p>
-            <w:r>
-              <w:t>Sam Whitfield</w:t>
-            </w:r>
-          </w:p>
-        </w:tc>
-        <w:tc>
-          <w:tcPr>
-            <w:tcW w:type="dxa" w:w="2160"/>
-          </w:tcPr>
-          <w:p>
-            <w:r>
-              <w:t>3 business days</w:t>
-            </w:r>
-          </w:p>
-        </w:tc>
-        <w:tc>
-          <w:tcPr>
-            <w:tcW w:type="dxa" w:w="2160"/>
-          </w:tcPr>
-          <w:p>
-            <w:r>
-              <w:t>Active</w:t>
-            </w:r>
-          </w:p>
-        </w:tc>
-      </w:tr>
-      <w:tr>
-        <w:tc>
-          <w:tcPr>
-            <w:tcW w:type="dxa" w:w="2160"/>
-          </w:tcPr>
-          <w:p>
-            <w:r>
-              <w:t>401(k) Enrollment and Employ Gate 2</w:t>
-            </w:r>
-          </w:p>
-        </w:tc>
-        <w:tc>
-          <w:tcPr>
-            <w:tcW w:type="dxa" w:w="2160"/>
-          </w:tcPr>
-          <w:p>
-            <w:r>
-              <w:t>Sam Whitfield</w:t>
-            </w:r>
-          </w:p>
-        </w:tc>
-        <w:tc>
-          <w:tcPr>
-            <w:tcW w:type="dxa" w:w="2160"/>
-          </w:tcPr>
-          <w:p>
-            <w:r>
-              <w:t>10 business days</w:t>
-            </w:r>
-          </w:p>
-        </w:tc>
-        <w:tc>
-          <w:tcPr>
-            <w:tcW w:type="dxa" w:w="2160"/>
-          </w:tcPr>
-          <w:p>
-            <w:r>
-              <w:t>Monitored</w:t>
-            </w:r>
-          </w:p>
-        </w:tc>
-      </w:tr>
-      <w:tr>
-        <w:tc>
-          <w:tcPr>
-            <w:tcW w:type="dxa" w:w="2160"/>
-          </w:tcPr>
-          <w:p>
-            <w:r>
-              <w:t>Sec-10</w:t>
-            </w:r>
-          </w:p>
-        </w:tc>
-        <w:tc>
-          <w:tcPr>
-            <w:tcW w:type="dxa" w:w="2160"/>
-          </w:tcPr>
-          <w:p>
-            <w:r>
-              <w:t>Sam Whitfield</w:t>
-            </w:r>
-          </w:p>
-        </w:tc>
-        <w:tc>
-          <w:tcPr>
-            <w:tcW w:type="dxa" w:w="2160"/>
-          </w:tcPr>
-          <w:p>
-            <w:r>
-              <w:t>5 business days</w:t>
-            </w:r>
-          </w:p>
-        </w:tc>
-        <w:tc>
-          <w:tcPr>
-            <w:tcW w:type="dxa" w:w="2160"/>
-          </w:tcPr>
-          <w:p>
-            <w:r>
-              <w:t>Stage 10 Verified</w:t>
-            </w:r>
-          </w:p>
-        </w:tc>
-      </w:tr>
-    </w:tbl>
-    <w:p>
-      <w:r>
-        <w:rPr>
-          <w:color w:val="808080"/>
-          <w:sz w:val="16"/>
-        </w:rPr>
-        <w:t>Page 10 of 12 | HR Knowledge Hub | Compensation and Benefits | SharePoint Online</w:t>
-      </w:r>
-    </w:p>
-    <w:p>
-      <w:r>
-        <w:br w:type="page"/>
-      </w:r>
-    </w:p>
-    <w:p>
-      <w:pPr>
-        <w:pStyle w:val="Heading1"/>
-      </w:pPr>
-      <w:r>
-        <w:t>Section 11: Continuous Improvement Roadmap</w:t>
-      </w:r>
-    </w:p>
-    <w:p>
-      <w:r>
-        <w:t>Explains automatic enrollment defaults, the employer match formula, and vesting schedule for retirement contributions. Section 11 (Continuous Improvement Roadmap) applies to Compensation and Benefits within HR Knowledge Hub and is maintained by Sam Whitfield. Schedules quarterly optimization milestones, automation targets, and capability reviews.</w:t>
-      </w:r>
-    </w:p>
-    <w:p>
-      <w:r>
-        <w:t>Operational requirement 11.1: Employer match vests over four years on a graded schedule. Secondary control 11.2: Loans against the 401(k) balance are limited to 50% of vested balance.</w:t>
-      </w:r>
-    </w:p>
-    <w:p>
-      <w:pPr>
-        <w:pStyle w:val="ListBullet"/>
-      </w:pPr>
-      <w:r>
-        <w:t>Employer match vests over four years on a graded schedule.</w:t>
-      </w:r>
-    </w:p>
-    <w:p>
-      <w:pPr>
-        <w:pStyle w:val="ListBullet"/>
-      </w:pPr>
-      <w:r>
-        <w:t>Loans against the 401(k) balance are limited to 50% of vested balance.</w:t>
-      </w:r>
-    </w:p>
-    <w:p>
-      <w:pPr>
-        <w:pStyle w:val="ListBullet"/>
-      </w:pPr>
-      <w:r>
-        <w:t>Section 11 review cadence is tracked by Sam Whitfield under Compensation and Benefits governance.</w:t>
-      </w:r>
-    </w:p>
-    <w:tbl>
-      <w:tblPr>
-        <w:tblStyle w:val="LightGrid-Accent1"/>
-        <w:tblW w:type="auto" w:w="0"/>
-        <w:tblLook w:firstColumn="1" w:firstRow="1" w:lastColumn="0" w:lastRow="0" w:noHBand="0" w:noVBand="1" w:val="04A0"/>
-      </w:tblPr>
-      <w:tblGrid>
-        <w:gridCol w:w="2160"/>
-        <w:gridCol w:w="2160"/>
-        <w:gridCol w:w="2160"/>
-        <w:gridCol w:w="2160"/>
-      </w:tblGrid>
-      <w:tr>
-        <w:tc>
-          <w:tcPr>
-            <w:tcW w:type="dxa" w:w="2160"/>
-          </w:tcPr>
-          <w:p>
-            <w:r>
-              <w:rPr>
-                <w:b/>
-              </w:rPr>
-              <w:t>Control Area</w:t>
-            </w:r>
-          </w:p>
-        </w:tc>
-        <w:tc>
-          <w:tcPr>
-            <w:tcW w:type="dxa" w:w="2160"/>
-          </w:tcPr>
-          <w:p>
-            <w:r>
-              <w:rPr>
-                <w:b/>
-              </w:rPr>
-              <w:t>Owner</w:t>
-            </w:r>
-          </w:p>
-        </w:tc>
-        <w:tc>
-          <w:tcPr>
-            <w:tcW w:type="dxa" w:w="2160"/>
-          </w:tcPr>
-          <w:p>
-            <w:r>
-              <w:rPr>
-                <w:b/>
-              </w:rPr>
-              <w:t>Target SLA</w:t>
-            </w:r>
-          </w:p>
-        </w:tc>
-        <w:tc>
-          <w:tcPr>
-            <w:tcW w:type="dxa" w:w="2160"/>
-          </w:tcPr>
-          <w:p>
-            <w:r>
-              <w:rPr>
-                <w:b/>
-              </w:rPr>
-              <w:t>Verification Status</w:t>
-            </w:r>
-          </w:p>
-        </w:tc>
-      </w:tr>
-      <w:tr>
-        <w:tc>
-          <w:tcPr>
-            <w:tcW w:type="dxa" w:w="2160"/>
-          </w:tcPr>
-          <w:p>
-            <w:r>
-              <w:t>Compensation and Benefits</w:t>
-            </w:r>
-          </w:p>
-        </w:tc>
-        <w:tc>
-          <w:tcPr>
-            <w:tcW w:type="dxa" w:w="2160"/>
-          </w:tcPr>
-          <w:p>
-            <w:r>
-              <w:t>Sam Whitfield</w:t>
-            </w:r>
-          </w:p>
-        </w:tc>
-        <w:tc>
-          <w:tcPr>
-            <w:tcW w:type="dxa" w:w="2160"/>
-          </w:tcPr>
-          <w:p>
-            <w:r>
-              <w:t>5 business days</w:t>
-            </w:r>
-          </w:p>
-        </w:tc>
-        <w:tc>
-          <w:tcPr>
-            <w:tcW w:type="dxa" w:w="2160"/>
-          </w:tcPr>
-          <w:p>
-            <w:r>
-              <w:t>Verified</w:t>
-            </w:r>
-          </w:p>
-        </w:tc>
-      </w:tr>
-      <w:tr>
-        <w:tc>
-          <w:tcPr>
-            <w:tcW w:type="dxa" w:w="2160"/>
-          </w:tcPr>
-          <w:p>
-            <w:r>
-              <w:t>401(k) Enrollment and Employ Gate 1</w:t>
-            </w:r>
-          </w:p>
-        </w:tc>
-        <w:tc>
-          <w:tcPr>
-            <w:tcW w:type="dxa" w:w="2160"/>
-          </w:tcPr>
-          <w:p>
-            <w:r>
-              <w:t>Sam Whitfield</w:t>
-            </w:r>
-          </w:p>
-        </w:tc>
-        <w:tc>
-          <w:tcPr>
-            <w:tcW w:type="dxa" w:w="2160"/>
-          </w:tcPr>
-          <w:p>
-            <w:r>
-              <w:t>3 business days</w:t>
-            </w:r>
-          </w:p>
-        </w:tc>
-        <w:tc>
-          <w:tcPr>
-            <w:tcW w:type="dxa" w:w="2160"/>
-          </w:tcPr>
-          <w:p>
-            <w:r>
-              <w:t>Active</w:t>
-            </w:r>
-          </w:p>
-        </w:tc>
-      </w:tr>
-      <w:tr>
-        <w:tc>
-          <w:tcPr>
-            <w:tcW w:type="dxa" w:w="2160"/>
-          </w:tcPr>
-          <w:p>
-            <w:r>
-              <w:t>401(k) Enrollment and Employ Gate 2</w:t>
-            </w:r>
-          </w:p>
-        </w:tc>
-        <w:tc>
-          <w:tcPr>
-            <w:tcW w:type="dxa" w:w="2160"/>
-          </w:tcPr>
-          <w:p>
-            <w:r>
-              <w:t>Sam Whitfield</w:t>
-            </w:r>
-          </w:p>
-        </w:tc>
-        <w:tc>
-          <w:tcPr>
-            <w:tcW w:type="dxa" w:w="2160"/>
-          </w:tcPr>
-          <w:p>
-            <w:r>
-              <w:t>10 business days</w:t>
-            </w:r>
-          </w:p>
-        </w:tc>
-        <w:tc>
-          <w:tcPr>
-            <w:tcW w:type="dxa" w:w="2160"/>
-          </w:tcPr>
-          <w:p>
-            <w:r>
-              <w:t>Monitored</w:t>
-            </w:r>
-          </w:p>
-        </w:tc>
-      </w:tr>
-      <w:tr>
-        <w:tc>
-          <w:tcPr>
-            <w:tcW w:type="dxa" w:w="2160"/>
-          </w:tcPr>
-          <w:p>
-            <w:r>
-              <w:t>Sec-11</w:t>
-            </w:r>
-          </w:p>
-        </w:tc>
-        <w:tc>
-          <w:tcPr>
-            <w:tcW w:type="dxa" w:w="2160"/>
-          </w:tcPr>
-          <w:p>
-            <w:r>
-              <w:t>Sam Whitfield</w:t>
-            </w:r>
-          </w:p>
-        </w:tc>
-        <w:tc>
-          <w:tcPr>
-            <w:tcW w:type="dxa" w:w="2160"/>
-          </w:tcPr>
-          <w:p>
-            <w:r>
-              <w:t>3 business days</w:t>
-            </w:r>
-          </w:p>
-        </w:tc>
-        <w:tc>
-          <w:tcPr>
-            <w:tcW w:type="dxa" w:w="2160"/>
-          </w:tcPr>
-          <w:p>
-            <w:r>
-              <w:t>Stage 11 Verified</w:t>
-            </w:r>
-          </w:p>
-        </w:tc>
-      </w:tr>
-    </w:tbl>
-    <w:p>
-      <w:r>
-        <w:drawing>
-          <wp:inline xmlns:a="http://schemas.openxmlformats.org/drawingml/2006/main" xmlns:pic="http://schemas.openxmlformats.org/drawingml/2006/picture">
-            <wp:extent cx="5303520" cy="1744579"/>
-            <wp:docPr id="6" name="Picture 6"/>
-            <wp:cNvGraphicFramePr>
-              <a:graphicFrameLocks noChangeAspect="1"/>
-            </wp:cNvGraphicFramePr>
-            <a:graphic>
-              <a:graphicData uri="http://schemas.openxmlformats.org/drawingml/2006/picture">
-                <pic:pic>
-                  <pic:nvPicPr>
-                    <pic:cNvPr id="0" name="image.png"/>
-                    <pic:cNvPicPr/>
-                  </pic:nvPicPr>
-                  <pic:blipFill>
-                    <a:blip r:embed="rId10"/>
-                    <a:stretch>
-                      <a:fillRect/>
-                    </a:stretch>
-                  </pic:blipFill>
-                  <pic:spPr>
-                    <a:xfrm>
-                      <a:off x="0" y="0"/>
-                      <a:ext cx="5303520" cy="1744579"/>
-                    </a:xfrm>
-                    <a:prstGeom prst="rect"/>
-                  </pic:spPr>
-                </pic:pic>
-              </a:graphicData>
-            </a:graphic>
-          </wp:inline>
-        </w:drawing>
-      </w:r>
-    </w:p>
-    <w:p>
-      <w:r>
-        <w:rPr>
-          <w:color w:val="808080"/>
-          <w:sz w:val="16"/>
-        </w:rPr>
-        <w:t>Page 11 of 12 | HR Knowledge Hub | Compensation and Benefits | SharePoint Online</w:t>
-      </w:r>
-    </w:p>
-    <w:p>
-      <w:r>
-        <w:br w:type="page"/>
-      </w:r>
-    </w:p>
-    <w:p>
-      <w:pPr>
-        <w:pStyle w:val="Heading1"/>
-      </w:pPr>
-      <w:r>
-        <w:t>Section 12: Appendix, Lineage &amp; Sign-off</w:t>
-      </w:r>
-    </w:p>
-    <w:p>
-      <w:r>
-        <w:t>Explains automatic enrollment defaults, the employer match formula, and vesting schedule for retirement contributions. Section 12 (Appendix, Lineage &amp; Sign-off) applies to Compensation and Benefits within HR Knowledge Hub and is maintained by Sam Whitfield. Records document lineage, governance metadata, version history, and owner sign-off.</w:t>
-      </w:r>
-    </w:p>
-    <w:p>
-      <w:r>
-        <w:t>Operational requirement 12.1: Loans against the 401(k) balance are limited to 50% of vested balance. Secondary control 12.2: New hires are auto-enrolled at 4% contribution after 30 days unless they opt out.</w:t>
-      </w:r>
-    </w:p>
-    <w:p>
-      <w:pPr>
-        <w:pStyle w:val="ListBullet"/>
-      </w:pPr>
-      <w:r>
-        <w:t>Loans against the 401(k) balance are limited to 50% of vested balance.</w:t>
-      </w:r>
-    </w:p>
-    <w:p>
-      <w:pPr>
-        <w:pStyle w:val="ListBullet"/>
-      </w:pPr>
-      <w:r>
-        <w:t>New hires are auto-enrolled at 4% contribution after 30 days unless they opt out.</w:t>
-      </w:r>
-    </w:p>
-    <w:p>
-      <w:pPr>
-        <w:pStyle w:val="ListBullet"/>
-      </w:pPr>
-      <w:r>
-        <w:t>Section 12 review cadence is tracked by Sam Whitfield under Compensation and Benefits governance.</w:t>
-      </w:r>
-    </w:p>
-    <w:tbl>
-      <w:tblPr>
-        <w:tblStyle w:val="LightGrid-Accent1"/>
-        <w:tblW w:type="auto" w:w="0"/>
-        <w:tblLook w:firstColumn="1" w:firstRow="1" w:lastColumn="0" w:lastRow="0" w:noHBand="0" w:noVBand="1" w:val="04A0"/>
-      </w:tblPr>
-      <w:tblGrid>
-        <w:gridCol w:w="2160"/>
-        <w:gridCol w:w="2160"/>
-        <w:gridCol w:w="2160"/>
-        <w:gridCol w:w="2160"/>
-      </w:tblGrid>
-      <w:tr>
-        <w:tc>
-          <w:tcPr>
-            <w:tcW w:type="dxa" w:w="2160"/>
-          </w:tcPr>
-          <w:p>
-            <w:r>
-              <w:rPr>
-                <w:b/>
-              </w:rPr>
-              <w:t>Control Area</w:t>
-            </w:r>
-          </w:p>
-        </w:tc>
-        <w:tc>
-          <w:tcPr>
-            <w:tcW w:type="dxa" w:w="2160"/>
-          </w:tcPr>
-          <w:p>
-            <w:r>
-              <w:rPr>
-                <w:b/>
-              </w:rPr>
-              <w:t>Owner</w:t>
-            </w:r>
-          </w:p>
-        </w:tc>
-        <w:tc>
-          <w:tcPr>
-            <w:tcW w:type="dxa" w:w="2160"/>
-          </w:tcPr>
-          <w:p>
-            <w:r>
-              <w:rPr>
-                <w:b/>
-              </w:rPr>
-              <w:t>Target SLA</w:t>
-            </w:r>
-          </w:p>
-        </w:tc>
-        <w:tc>
-          <w:tcPr>
-            <w:tcW w:type="dxa" w:w="2160"/>
-          </w:tcPr>
-          <w:p>
-            <w:r>
-              <w:rPr>
-                <w:b/>
-              </w:rPr>
-              <w:t>Verification Status</w:t>
-            </w:r>
-          </w:p>
-        </w:tc>
-      </w:tr>
-      <w:tr>
-        <w:tc>
-          <w:tcPr>
-            <w:tcW w:type="dxa" w:w="2160"/>
-          </w:tcPr>
-          <w:p>
-            <w:r>
-              <w:t>Compensation and Benefits</w:t>
-            </w:r>
-          </w:p>
-        </w:tc>
-        <w:tc>
-          <w:tcPr>
-            <w:tcW w:type="dxa" w:w="2160"/>
-          </w:tcPr>
-          <w:p>
-            <w:r>
-              <w:t>Sam Whitfield</w:t>
-            </w:r>
-          </w:p>
-        </w:tc>
-        <w:tc>
-          <w:tcPr>
-            <w:tcW w:type="dxa" w:w="2160"/>
-          </w:tcPr>
-          <w:p>
-            <w:r>
-              <w:t>5 business days</w:t>
-            </w:r>
-          </w:p>
-        </w:tc>
-        <w:tc>
-          <w:tcPr>
-            <w:tcW w:type="dxa" w:w="2160"/>
-          </w:tcPr>
-          <w:p>
-            <w:r>
-              <w:t>Verified</w:t>
-            </w:r>
-          </w:p>
-        </w:tc>
-      </w:tr>
-      <w:tr>
-        <w:tc>
-          <w:tcPr>
-            <w:tcW w:type="dxa" w:w="2160"/>
-          </w:tcPr>
-          <w:p>
-            <w:r>
-              <w:t>401(k) Enrollment and Employ Gate 1</w:t>
-            </w:r>
-          </w:p>
-        </w:tc>
-        <w:tc>
-          <w:tcPr>
-            <w:tcW w:type="dxa" w:w="2160"/>
-          </w:tcPr>
-          <w:p>
-            <w:r>
-              <w:t>Sam Whitfield</w:t>
-            </w:r>
-          </w:p>
-        </w:tc>
-        <w:tc>
-          <w:tcPr>
-            <w:tcW w:type="dxa" w:w="2160"/>
-          </w:tcPr>
-          <w:p>
-            <w:r>
-              <w:t>3 business days</w:t>
-            </w:r>
-          </w:p>
-        </w:tc>
-        <w:tc>
-          <w:tcPr>
-            <w:tcW w:type="dxa" w:w="2160"/>
-          </w:tcPr>
-          <w:p>
-            <w:r>
-              <w:t>Active</w:t>
-            </w:r>
-          </w:p>
-        </w:tc>
-      </w:tr>
-      <w:tr>
-        <w:tc>
-          <w:tcPr>
-            <w:tcW w:type="dxa" w:w="2160"/>
-          </w:tcPr>
-          <w:p>
-            <w:r>
-              <w:t>401(k) Enrollment and Employ Gate 2</w:t>
-            </w:r>
-          </w:p>
-        </w:tc>
-        <w:tc>
-          <w:tcPr>
-            <w:tcW w:type="dxa" w:w="2160"/>
-          </w:tcPr>
-          <w:p>
-            <w:r>
-              <w:t>Sam Whitfield</w:t>
-            </w:r>
-          </w:p>
-        </w:tc>
-        <w:tc>
-          <w:tcPr>
-            <w:tcW w:type="dxa" w:w="2160"/>
-          </w:tcPr>
-          <w:p>
-            <w:r>
-              <w:t>10 business days</w:t>
-            </w:r>
-          </w:p>
-        </w:tc>
-        <w:tc>
-          <w:tcPr>
-            <w:tcW w:type="dxa" w:w="2160"/>
-          </w:tcPr>
-          <w:p>
-            <w:r>
-              <w:t>Monitored</w:t>
-            </w:r>
-          </w:p>
-        </w:tc>
-      </w:tr>
-      <w:tr>
-        <w:tc>
-          <w:tcPr>
-            <w:tcW w:type="dxa" w:w="2160"/>
-          </w:tcPr>
-          <w:p>
-            <w:r>
-              <w:t>Sec-12</w:t>
-            </w:r>
-          </w:p>
-        </w:tc>
-        <w:tc>
-          <w:tcPr>
-            <w:tcW w:type="dxa" w:w="2160"/>
-          </w:tcPr>
-          <w:p>
-            <w:r>
-              <w:t>Sam Whitfield</w:t>
-            </w:r>
-          </w:p>
-        </w:tc>
-        <w:tc>
-          <w:tcPr>
-            <w:tcW w:type="dxa" w:w="2160"/>
-          </w:tcPr>
-          <w:p>
-            <w:r>
-              <w:t>10 business days</w:t>
-            </w:r>
-          </w:p>
-        </w:tc>
-        <w:tc>
-          <w:tcPr>
-            <w:tcW w:type="dxa" w:w="2160"/>
-          </w:tcPr>
-          <w:p>
-            <w:r>
-              <w:t>Stage 12 Verified</w:t>
-            </w:r>
-          </w:p>
-        </w:tc>
-      </w:tr>
-    </w:tbl>
-    <w:p>
-      <w:r>
-        <w:rPr>
-          <w:color w:val="808080"/>
-          <w:sz w:val="16"/>
-        </w:rPr>
-        <w:t>Page 12 of 12 | HR Knowledge Hub | Compensation and Benefits | SharePoint Online</w:t>
+        <w:t>Page 4 of 4 | HR Knowledge Hub | Compensation and Benefits | SharePoint Online</w:t>
       </w:r>
     </w:p>
     <w:sectPr>

</xml_diff>